<commit_message>
Linkuri corectate: litere mari/mici, greșeli de scriere, docx fără byethost
- ProgList.pdf: Electron1S → Electron1s, PlankML → PlanckML
- LagrangianQED.pdf: spin.pdf → Spin.pdf
- T&SQ.pdf: ElectEcuat → ElecEcuat
- TOnduscular.pdf: linkul OndSLPpdf → OndSLP.pdf
- Photon equation.docx, Theory of information.docx: byethost → github.io

Co-Authored-By: Claude Opus 5.5 <noreply@anthropic.com>
</commit_message>
<xml_diff>
--- a/Photon equation.docx
+++ b/Photon equation.docx
@@ -24140,7 +24140,7 @@
             <w:sz w:val="24"/>
             <w:szCs w:val="24"/>
           </w:rPr>
-          <w:t>http://www.michaelvio.byethost8.com/PhotonAi.pdf</w:t>
+          <w:t xml:space="preserve">https://michaelvio.github.io/PhotonAi.pdf</w:t>
         </w:r>
       </w:hyperlink>
     </w:p>
@@ -24498,7 +24498,7 @@
             <w:rStyle w:val="Hyperlink"/>
             <w:rFonts w:ascii="Times New Roman" w:hAnsi="Times New Roman" w:cs="Times New Roman"/>
           </w:rPr>
-          <w:t>http://www.michaelvio.byethost8.com/masphot.pdf</w:t>
+          <w:t xml:space="preserve">https://michaelvio.github.io/masphot.pdf</w:t>
         </w:r>
       </w:hyperlink>
     </w:p>
@@ -24576,7 +24576,7 @@
             <w:rStyle w:val="Hyperlink"/>
             <w:rFonts w:ascii="Times New Roman" w:hAnsi="Times New Roman" w:cs="Times New Roman"/>
           </w:rPr>
-          <w:t>http://www.michaelvio.byethost8.com/Magnet.pdf</w:t>
+          <w:t xml:space="preserve">https://michaelvio.github.io/Magnet.pdf</w:t>
         </w:r>
       </w:hyperlink>
       <w:r>
@@ -24819,7 +24819,7 @@
             <w:rStyle w:val="Hyperlink"/>
             <w:rFonts w:ascii="Times New Roman" w:hAnsi="Times New Roman" w:cs="Times New Roman"/>
           </w:rPr>
-          <w:t>http://www.michaelvio.byethost8.com/grating.pdf</w:t>
+          <w:t xml:space="preserve">https://michaelvio.github.io/grating.pdf</w:t>
         </w:r>
       </w:hyperlink>
       <w:r>
@@ -24894,7 +24894,7 @@
             <w:rStyle w:val="Hyperlink"/>
             <w:rFonts w:ascii="Times New Roman" w:hAnsi="Times New Roman" w:cs="Times New Roman"/>
           </w:rPr>
-          <w:t>http://www.michaelvio.byethost8.com/PhotonAi.pdf</w:t>
+          <w:t xml:space="preserve">https://michaelvio.github.io/PhotonAi.pdf</w:t>
         </w:r>
       </w:hyperlink>
     </w:p>

</xml_diff>